<commit_message>
Revise script for 3 minute presentation
</commit_message>
<xml_diff>
--- a/presentation/Pro_Gamer_Physical_Test_발표대본.docx
+++ b/presentation/Pro_Gamer_Physical_Test_발표대본.docx
@@ -4,7 +4,7 @@
   <w:body>
     <w:p>
       <w:pPr>
-        <w:spacing w:after="320"/>
+        <w:spacing w:after="280"/>
         <w:jc w:val="center"/>
       </w:pPr>
       <w:r>
@@ -14,12 +14,12 @@
           <w:color w:val="1F4D78"/>
           <w:sz w:val="40"/>
         </w:rPr>
-        <w:t>Pro Gamer Physical Test 중간발표 대본</w:t>
+        <w:t>프로그래밍랩 중간발표 대본</w:t>
       </w:r>
     </w:p>
     <w:p>
       <w:pPr>
-        <w:spacing w:before="140" w:after="60"/>
+        <w:spacing w:before="100" w:after="40"/>
       </w:pPr>
       <w:r>
         <w:rPr>
@@ -40,12 +40,12 @@
           <w:rFonts w:ascii="Malgun Gothic" w:hAnsi="Malgun Gothic" w:eastAsia="Malgun Gothic"/>
           <w:sz w:val="21"/>
         </w:rPr>
-        <w:t>안녕하세요. 제가 기획한 게임은 Pro Gamer Physical Test입니다. 반응속도, 정확도, 순발력 같은 게임 피지컬을 간단한 미니게임으로 테스트하고, 최종 결과를 티어로 보여주는 C언어 콘솔 게임입니다.</w:t>
+        <w:t>안녕하세요. 2071146 이정환입니다. 제가 발표할 프로젝트는 프로게이머 피지컬 테스트입니다. 이 게임은 반응속도, 순발력, 클릭 속도, 타이밍 감각처럼 게임에서 자주 필요한 피지컬 요소를 간단한 미니게임으로 측정하는 C언어 콘솔 게임입니다.</w:t>
       </w:r>
     </w:p>
     <w:p>
       <w:pPr>
-        <w:spacing w:before="140" w:after="60"/>
+        <w:spacing w:before="100" w:after="40"/>
       </w:pPr>
       <w:r>
         <w:rPr>
@@ -54,7 +54,7 @@
           <w:color w:val="2E74B5"/>
           <w:sz w:val="24"/>
         </w:rPr>
-        <w:t>2. 게임 개요</w:t>
+        <w:t>2. 게임 기획</w:t>
       </w:r>
     </w:p>
     <w:p>
@@ -66,12 +66,12 @@
           <w:rFonts w:ascii="Malgun Gothic" w:hAnsi="Malgun Gothic" w:eastAsia="Malgun Gothic"/>
           <w:sz w:val="21"/>
         </w:rPr>
-        <w:t>이 게임의 핵심은 단순히 점수만 보여주는 것이 아니라, 내가 어느 정도 실력인지 바로 이해할 수 있게 티어로 보여주는 것입니다. 플랫폼은 PC이고, 개발 환경은 수업 환경에 맞춰 Windows 콘솔과 Visual Studio를 기준으로 잡았습니다.</w:t>
+        <w:t>기획 의도는 웹이나 앱에 따로 나누어져 있는 피지컬 테스트들을 하나의 게임 안에 모으는 것입니다. 사용자는 메인 메뉴에서 원하는 미니게임을 선택해 플레이할 수 있고, 네 가지 테스트를 모두 완료하면 총점과 티어가 표시됩니다. 단순히 점수만 보여주는 것보다 아이언, 브론즈, 실버 같은 티어로 결과를 보여주면 사용자가 자신의 수준을 더 직관적으로 이해할 수 있습니다.</w:t>
       </w:r>
     </w:p>
     <w:p>
       <w:pPr>
-        <w:spacing w:before="140" w:after="60"/>
+        <w:spacing w:before="100" w:after="40"/>
       </w:pPr>
       <w:r>
         <w:rPr>
@@ -80,7 +80,7 @@
           <w:color w:val="2E74B5"/>
           <w:sz w:val="24"/>
         </w:rPr>
-        <w:t>3. 핵심 재미</w:t>
+        <w:t>3. 시스템 구조</w:t>
       </w:r>
     </w:p>
     <w:p>
@@ -92,12 +92,12 @@
           <w:rFonts w:ascii="Malgun Gothic" w:hAnsi="Malgun Gothic" w:eastAsia="Malgun Gothic"/>
           <w:sz w:val="21"/>
         </w:rPr>
-        <w:t>테스트는 짧고 직관적으로 구성했습니다. 반응속도, 방향키 입력, 마우스 클릭, 타이밍처럼 각각 다른 피지컬을 측정합니다. 여러 테스트를 끝낸 뒤 점수가 합산되고, 최종 티어가 나오기 때문에 다시 도전하고 싶은 구조를 만들 수 있습니다.</w:t>
+        <w:t>시스템 구조는 크게 네 부분으로 나누었습니다. main은 메뉴 출력과 전체 게임 흐름을 관리합니다. play_* 함수들은 네 가지 미니게임을 각각 실행합니다. score 함수는 각 테스트 점수를 합산하고 최종 티어를 판정합니다. 마지막으로 util은 키 입력, 화면 초기화, 시간 측정처럼 여러 곳에서 반복해서 쓰이는 기능을 담당합니다. 이렇게 역할을 나누면 나중에 기능을 수정하거나 추가할 때 코드 관리가 쉬워집니다.</w:t>
       </w:r>
     </w:p>
     <w:p>
       <w:pPr>
-        <w:spacing w:before="140" w:after="60"/>
+        <w:spacing w:before="100" w:after="40"/>
       </w:pPr>
       <w:r>
         <w:rPr>
@@ -106,7 +106,7 @@
           <w:color w:val="2E74B5"/>
           <w:sz w:val="24"/>
         </w:rPr>
-        <w:t>4. 게임 진행 방식</w:t>
+        <w:t>4. 핵심 구현 기능</w:t>
       </w:r>
     </w:p>
     <w:p>
@@ -118,12 +118,12 @@
           <w:rFonts w:ascii="Malgun Gothic" w:hAnsi="Malgun Gothic" w:eastAsia="Malgun Gothic"/>
           <w:sz w:val="21"/>
         </w:rPr>
-        <w:t>게임은 메인 메뉴에서 시작합니다. 사용자는 원하는 미니게임을 선택해서 플레이하고, 4개의 테스트를 모두 완료하면 총점과 티어를 확인합니다. 결과 확인 후에는 다시 하거나 종료할 수 있습니다.</w:t>
+        <w:t>핵심 구현 기능은 입력 처리, 시간 측정, 점수 계산입니다. 키 입력은 conio.h의 _getch()와 _kbhit()를 사용해서 즉시 반응하도록 처리할 계획입니다. 반응속도나 타이밍 테스트에는 windows.h의 Sleep()과 QueryPerformanceCounter()를 사용해 시간을 측정합니다. 각 테스트는 100점 만점으로 계산하고, 총점은 400점 만점입니다. 최종 점수 구간에 따라 아이언부터 다이아몬드까지 티어를 부여합니다.</w:t>
       </w:r>
     </w:p>
     <w:p>
       <w:pPr>
-        <w:spacing w:before="140" w:after="60"/>
+        <w:spacing w:before="100" w:after="40"/>
       </w:pPr>
       <w:r>
         <w:rPr>
@@ -132,7 +132,7 @@
           <w:color w:val="2E74B5"/>
           <w:sz w:val="24"/>
         </w:rPr>
-        <w:t>5. 미니게임 구성</w:t>
+        <w:t>5. 시연</w:t>
       </w:r>
     </w:p>
     <w:p>
@@ -144,12 +144,12 @@
           <w:rFonts w:ascii="Malgun Gothic" w:hAnsi="Malgun Gothic" w:eastAsia="Malgun Gothic"/>
           <w:sz w:val="21"/>
         </w:rPr>
-        <w:t>첫 번째는 신호가 나온 뒤 스페이스바를 누르는 반응속도 테스트입니다. 두 번째는 랜덤 방향키를 빠르게 입력하는 테스트입니다. 세 번째는 제한 시간 동안 마우스를 얼마나 많이 클릭하는지 보는 테스트이고, 네 번째는 떨어지는 표시를 목표 위치에 가깝게 멈추는 타이밍 테스트입니다.</w:t>
+        <w:t>시연에서는 먼저 메인 메뉴에서 테스트를 선택하는 흐름을 보여드릴 예정입니다. 이후 반응속도 테스트, 방향키 테스트, 클릭 테스트, 타이밍 테스트를 순서대로 실행하고, 마지막에 총점과 티어가 출력되는 결과 화면을 보여드리겠습니다. 아직 완성 전 단계이기 때문에 시연에서는 전체 구조와 핵심 동작이 어떻게 이어지는지를 중심으로 설명하겠습니다.</w:t>
       </w:r>
     </w:p>
     <w:p>
       <w:pPr>
-        <w:spacing w:before="140" w:after="60"/>
+        <w:spacing w:before="100" w:after="40"/>
       </w:pPr>
       <w:r>
         <w:rPr>
@@ -158,7 +158,7 @@
           <w:color w:val="2E74B5"/>
           <w:sz w:val="24"/>
         </w:rPr>
-        <w:t>6. 점수와 티어</w:t>
+        <w:t>6. 향후 계획</w:t>
       </w:r>
     </w:p>
     <w:p>
@@ -170,116 +170,12 @@
           <w:rFonts w:ascii="Malgun Gothic" w:hAnsi="Malgun Gothic" w:eastAsia="Malgun Gothic"/>
           <w:sz w:val="21"/>
         </w:rPr>
-        <w:t>각 미니게임 점수를 합산해서 최종 점수를 만들고, 점수 구간에 따라 IRON부터 DIAMOND까지 티어를 부여합니다. 예를 들어 총점이 315점이면 GOLD가 나오도록 설계했습니다. 이렇게 하면 결과 화면이 더 직관적이고 재미있어집니다.</w:t>
-      </w:r>
-    </w:p>
-    <w:p>
-      <w:pPr>
-        <w:spacing w:before="140" w:after="60"/>
-      </w:pPr>
-      <w:r>
-        <w:rPr>
-          <w:rFonts w:ascii="Malgun Gothic" w:hAnsi="Malgun Gothic" w:eastAsia="Malgun Gothic"/>
-          <w:b/>
-          <w:color w:val="2E74B5"/>
-          <w:sz w:val="24"/>
-        </w:rPr>
-        <w:t>7. UI / UX</w:t>
-      </w:r>
-    </w:p>
-    <w:p>
-      <w:pPr>
-        <w:ind w:firstLine="173"/>
-      </w:pPr>
-      <w:r>
-        <w:rPr>
-          <w:rFonts w:ascii="Malgun Gothic" w:hAnsi="Malgun Gothic" w:eastAsia="Malgun Gothic"/>
-          <w:sz w:val="21"/>
-        </w:rPr>
-        <w:t>그래픽은 콘솔 문자 기반 ASCII 스타일로 구현합니다. 화면은 복잡하게 만들기보다 메뉴, 현재 테스트, 결과가 잘 보이도록 단순하게 구성할 계획입니다. 결과 화면에서는 각 테스트 점수와 총점, 티어를 한 번에 확인할 수 있게 합니다.</w:t>
-      </w:r>
-    </w:p>
-    <w:p>
-      <w:pPr>
-        <w:spacing w:before="140" w:after="60"/>
-      </w:pPr>
-      <w:r>
-        <w:rPr>
-          <w:rFonts w:ascii="Malgun Gothic" w:hAnsi="Malgun Gothic" w:eastAsia="Malgun Gothic"/>
-          <w:b/>
-          <w:color w:val="2E74B5"/>
-          <w:sz w:val="24"/>
-        </w:rPr>
-        <w:t>8. 구현 구조</w:t>
-      </w:r>
-    </w:p>
-    <w:p>
-      <w:pPr>
-        <w:ind w:firstLine="173"/>
-      </w:pPr>
-      <w:r>
-        <w:rPr>
-          <w:rFonts w:ascii="Malgun Gothic" w:hAnsi="Malgun Gothic" w:eastAsia="Malgun Gothic"/>
-          <w:sz w:val="21"/>
-        </w:rPr>
-        <w:t>구현할 때는 게임 로직과 콘솔 입출력 기능을 분리하려고 합니다. 예를 들어 main은 메뉴와 흐름을 담당하고, game_tests는 각 미니게임을 담당합니다. score는 점수와 티어 계산을 맡고, console_util은 gotoxy나 키 입력 같은 콘솔 전용 함수를 따로 관리합니다.</w:t>
-      </w:r>
-    </w:p>
-    <w:p>
-      <w:pPr>
-        <w:spacing w:before="140" w:after="60"/>
-      </w:pPr>
-      <w:r>
-        <w:rPr>
-          <w:rFonts w:ascii="Malgun Gothic" w:hAnsi="Malgun Gothic" w:eastAsia="Malgun Gothic"/>
-          <w:b/>
-          <w:color w:val="2E74B5"/>
-          <w:sz w:val="24"/>
-        </w:rPr>
-        <w:t>9. 개발 일정</w:t>
-      </w:r>
-    </w:p>
-    <w:p>
-      <w:pPr>
-        <w:ind w:firstLine="173"/>
-      </w:pPr>
-      <w:r>
-        <w:rPr>
-          <w:rFonts w:ascii="Malgun Gothic" w:hAnsi="Malgun Gothic" w:eastAsia="Malgun Gothic"/>
-          <w:sz w:val="21"/>
-        </w:rPr>
-        <w:t>전체 일정은 6주로 잡았습니다. 1주차에는 기획서와 구조 설계를 하고, 이후 메인 메뉴와 입력 처리, 각 미니게임 구현, 마지막으로 점수 계산과 버그 수정을 진행합니다. 개인 개발이기 때문에 기능 범위를 너무 넓히지 않고 완성도를 우선할 계획입니다.</w:t>
-      </w:r>
-    </w:p>
-    <w:p>
-      <w:pPr>
-        <w:spacing w:before="140" w:after="60"/>
-      </w:pPr>
-      <w:r>
-        <w:rPr>
-          <w:rFonts w:ascii="Malgun Gothic" w:hAnsi="Malgun Gothic" w:eastAsia="Malgun Gothic"/>
-          <w:b/>
-          <w:color w:val="2E74B5"/>
-          <w:sz w:val="24"/>
-        </w:rPr>
-        <w:t>10. 리스크와 다음 목표</w:t>
-      </w:r>
-    </w:p>
-    <w:p>
-      <w:pPr>
-        <w:ind w:firstLine="173"/>
-      </w:pPr>
-      <w:r>
-        <w:rPr>
-          <w:rFonts w:ascii="Malgun Gothic" w:hAnsi="Malgun Gothic" w:eastAsia="Malgun Gothic"/>
-          <w:sz w:val="21"/>
-        </w:rPr>
-        <w:t>가장 큰 리스크는 Mac과 Windows의 콘솔 함수 차이입니다. 그래서 최종 제출은 Windows 콘솔 기준으로 검증하고, 입력과 출력 관련 코드는 따로 분리해 수정하기 쉽게 만들겠습니다. 다음 단계는 메인 메뉴와 입력 처리부터 구현하고, 미니게임을 하나씩 점수 시스템에 연결하는 것입니다. 감사합니다.</w:t>
+        <w:t>앞으로는 세 가지를 중심으로 개선할 계획입니다. 첫 번째는 게임 개편입니다. 테스트별 난이도와 점수 기준을 실제 플레이 결과에 맞게 조정하겠습니다. 두 번째는 파일 구조 개편입니다. 기능별로 코드를 더 명확하게 분리해 유지보수하기 쉽게 만들겠습니다. 세 번째는 티어 목록 개편입니다. 최종 결과가 더 보기 좋게 나오도록 티어 이름과 점수 구간을 정리하겠습니다. 이상으로 발표를 마치겠습니다. 감사합니다.</w:t>
       </w:r>
     </w:p>
     <w:sectPr>
       <w:pgSz w:w="12240" w:h="15840"/>
-      <w:pgMar w:top="1080" w:right="1224" w:bottom="1080" w:left="1224" w:header="720" w:footer="720" w:gutter="0"/>
+      <w:pgMar w:top="1152" w:right="1224" w:bottom="1152" w:left="1224" w:header="720" w:footer="720" w:gutter="0"/>
       <w:cols w:space="720"/>
       <w:docGrid w:linePitch="360"/>
     </w:sectPr>
@@ -651,7 +547,7 @@
     <w:qFormat/>
     <w:rsid w:val="00FC693F"/>
     <w:pPr>
-      <w:spacing w:line="276" w:lineRule="auto" w:after="140"/>
+      <w:spacing w:line="276" w:lineRule="auto" w:after="120"/>
     </w:pPr>
     <w:rPr>
       <w:rFonts w:ascii="Malgun Gothic" w:hAnsi="Malgun Gothic" w:eastAsia="Malgun Gothic"/>

</xml_diff>